<commit_message>
NAIA: clip de Grok, 2 videos verticales con subtítulos, captions y paquete para el calendario
Co-Authored-By: Claude Opus 5.5 <noreply@anthropic.com>
Claude-Session: https://claude.ai/code/session_01575tSk5hf54pmGQ4qcNCo5
</commit_message>
<xml_diff>
--- a/nica-apify/naia/LINEAMIENTOS_NAIA_para_calendario.docx
+++ b/nica-apify/naia/LINEAMIENTOS_NAIA_para_calendario.docx
@@ -2,7 +2,7 @@
 <file path=word/document.xml><?xml version="1.0" encoding="utf-8"?>
 <w:document xmlns:w="http://schemas.openxmlformats.org/wordprocessingml/2006/main" xmlns:m="http://schemas.openxmlformats.org/officeDocument/2006/math" xmlns:r="http://schemas.openxmlformats.org/officeDocument/2006/relationships" xmlns:o="urn:schemas-microsoft-com:office:office" xmlns:v="urn:schemas-microsoft-com:vml" xmlns:w10="urn:schemas-microsoft-com:office:word" xmlns:a="http://schemas.openxmlformats.org/drawingml/2006/main" xmlns:pic="http://schemas.openxmlformats.org/drawingml/2006/picture" xmlns:wp="http://schemas.openxmlformats.org/drawingml/2006/wordprocessingDrawing">
   <w:body>
-    <w:bookmarkStart w:id="28" w:name="X0c2a59dc7dc337ab663efd10c0cae180e4ad560"/>
+    <w:bookmarkStart w:id="31" w:name="X0c2a59dc7dc337ab663efd10c0cae180e4ad560"/>
     <w:p>
       <w:pPr>
         <w:pStyle w:val="Heading1"/>
@@ -683,17 +683,29 @@
         <w:pStyle w:val="Compact"/>
       </w:pPr>
       <w:r>
-        <w:t xml:space="preserve">Se hace</w:t>
-      </w:r>
-      <w:r>
-        <w:t xml:space="preserve"> </w:t>
-      </w:r>
-      <w:r>
-        <w:rPr>
-          <w:bCs/>
-          <w:b/>
-        </w:rPr>
-        <w:t xml:space="preserve">UN solo clip de 6 s en Grok</w:t>
+        <w:t xml:space="preserve">Clip de Grok YA HECHO (10 s, archivo</w:t>
+      </w:r>
+      <w:r>
+        <w:t xml:space="preserve"> </w:t>
+      </w:r>
+      <w:r>
+        <w:rPr>
+          <w:rStyle w:val="VerbatimChar"/>
+        </w:rPr>
+        <w:t xml:space="preserve">NAIA_CLIP_GROK_bucle.mp4</w:t>
+      </w:r>
+      <w:r>
+        <w:t xml:space="preserve">). Se hizo</w:t>
+      </w:r>
+      <w:r>
+        <w:t xml:space="preserve"> </w:t>
+      </w:r>
+      <w:r>
+        <w:rPr>
+          <w:bCs/>
+          <w:b/>
+        </w:rPr>
+        <w:t xml:space="preserve">UN solo clip en Grok</w:t>
       </w:r>
       <w:r>
         <w:t xml:space="preserve"> </w:t>
@@ -1121,11 +1133,389 @@
         <w:t xml:space="preserve">.</w:t>
       </w:r>
     </w:p>
+    <w:bookmarkEnd w:id="27"/>
+    <w:bookmarkStart w:id="28" w:name="videos-listos-vertical-916-10801920"/>
+    <w:p>
+      <w:pPr>
+        <w:pStyle w:val="Heading2"/>
+      </w:pPr>
+      <w:r>
+        <w:t xml:space="preserve">9. Videos listos (vertical 9:16, 1080×1920)</w:t>
+      </w:r>
+    </w:p>
+    <w:tbl>
+      <w:tblPr>
+        <w:tblStyle w:val="Table"/>
+        <w:tblW w:type="pct" w:w="5000"/>
+        <w:tblLook w:firstRow="1" w:lastRow="0" w:firstColumn="0" w:lastColumn="0" w:noHBand="0" w:noVBand="0" w:val="0020"/>
+        <w:jc w:val="start"/>
+      </w:tblPr>
+      <w:tblGrid>
+        <w:gridCol w:w="2640"/>
+        <w:gridCol w:w="2640"/>
+        <w:gridCol w:w="2640"/>
+      </w:tblGrid>
+      <w:tr>
+        <w:trPr>
+          <w:tblHeader w:val="true"/>
+        </w:trPr>
+        <w:tc>
+          <w:tcPr/>
+          <w:p>
+            <w:pPr>
+              <w:pStyle w:val="Compact"/>
+              <w:jc w:val="left"/>
+            </w:pPr>
+            <w:r>
+              <w:t xml:space="preserve">Archivo</w:t>
+            </w:r>
+          </w:p>
+        </w:tc>
+        <w:tc>
+          <w:tcPr/>
+          <w:p>
+            <w:pPr>
+              <w:pStyle w:val="Compact"/>
+              <w:jc w:val="left"/>
+            </w:pPr>
+            <w:r>
+              <w:t xml:space="preserve">Duración</w:t>
+            </w:r>
+          </w:p>
+        </w:tc>
+        <w:tc>
+          <w:tcPr/>
+          <w:p>
+            <w:pPr>
+              <w:pStyle w:val="Compact"/>
+              <w:jc w:val="left"/>
+            </w:pPr>
+            <w:r>
+              <w:t xml:space="preserve">Título en pantalla (3 s)</w:t>
+            </w:r>
+          </w:p>
+        </w:tc>
+      </w:tr>
+      <w:tr>
+        <w:tc>
+          <w:tcPr/>
+          <w:p>
+            <w:pPr>
+              <w:pStyle w:val="Compact"/>
+              <w:jc w:val="left"/>
+            </w:pPr>
+            <w:r>
+              <w:rPr>
+                <w:rStyle w:val="VerbatimChar"/>
+              </w:rPr>
+              <w:t xml:space="preserve">naia-01_activacion-de-abundancia.mp4</w:t>
+            </w:r>
+          </w:p>
+        </w:tc>
+        <w:tc>
+          <w:tcPr/>
+          <w:p>
+            <w:pPr>
+              <w:pStyle w:val="Compact"/>
+              <w:jc w:val="left"/>
+            </w:pPr>
+            <w:r>
+              <w:t xml:space="preserve">43 s</w:t>
+            </w:r>
+          </w:p>
+        </w:tc>
+        <w:tc>
+          <w:tcPr/>
+          <w:p>
+            <w:pPr>
+              <w:pStyle w:val="Compact"/>
+              <w:jc w:val="left"/>
+            </w:pPr>
+            <w:r>
+              <w:t xml:space="preserve">ACTIVACIÓN DE ABUNDANCIA</w:t>
+            </w:r>
+          </w:p>
+        </w:tc>
+      </w:tr>
+      <w:tr>
+        <w:tc>
+          <w:tcPr/>
+          <w:p>
+            <w:pPr>
+              <w:pStyle w:val="Compact"/>
+              <w:jc w:val="left"/>
+            </w:pPr>
+            <w:r>
+              <w:rPr>
+                <w:rStyle w:val="VerbatimChar"/>
+              </w:rPr>
+              <w:t xml:space="preserve">naia-02_activacion-del-exito.mp4</w:t>
+            </w:r>
+          </w:p>
+        </w:tc>
+        <w:tc>
+          <w:tcPr/>
+          <w:p>
+            <w:pPr>
+              <w:pStyle w:val="Compact"/>
+              <w:jc w:val="left"/>
+            </w:pPr>
+            <w:r>
+              <w:t xml:space="preserve">46 s</w:t>
+            </w:r>
+          </w:p>
+        </w:tc>
+        <w:tc>
+          <w:tcPr/>
+          <w:p>
+            <w:pPr>
+              <w:pStyle w:val="Compact"/>
+              <w:jc w:val="left"/>
+            </w:pPr>
+            <w:r>
+              <w:t xml:space="preserve">ACTIVACIÓN DEL ÉXITO</w:t>
+            </w:r>
+          </w:p>
+        </w:tc>
+      </w:tr>
+    </w:tbl>
     <w:p>
       <w:pPr>
         <w:pStyle w:val="BodyText"/>
       </w:pPr>
       <w:r>
+        <w:t xml:space="preserve">Llevan subtítulos sincronizados y</w:t>
+      </w:r>
+      <w:r>
+        <w:t xml:space="preserve"> </w:t>
+      </w:r>
+      <w:r>
+        <w:t xml:space="preserve">“</w:t>
+      </w:r>
+      <w:r>
+        <w:t xml:space="preserve">NAIA ·</w:t>
+      </w:r>
+      <w:r>
+        <w:t xml:space="preserve"> </w:t>
+      </w:r>
+      <w:r>
+        <w:t xml:space="preserve">@mabradiante</w:t>
+      </w:r>
+      <w:r>
+        <w:t xml:space="preserve">”</w:t>
+      </w:r>
+      <w:r>
+        <w:t xml:space="preserve"> </w:t>
+      </w:r>
+      <w:r>
+        <w:t xml:space="preserve">fijo. Sirven igual para TikTok, Reels, Shorts y estado de WhatsApp.</w:t>
+      </w:r>
+    </w:p>
+    <w:bookmarkEnd w:id="28"/>
+    <w:bookmarkStart w:id="29" w:name="captions-copiar-y-pegar"/>
+    <w:p>
+      <w:pPr>
+        <w:pStyle w:val="Heading2"/>
+      </w:pPr>
+      <w:r>
+        <w:t xml:space="preserve">10. Captions (copiar y pegar)</w:t>
+      </w:r>
+    </w:p>
+    <w:p>
+      <w:pPr>
+        <w:pStyle w:val="FirstParagraph"/>
+      </w:pPr>
+      <w:r>
+        <w:rPr>
+          <w:bCs/>
+          <w:b/>
+        </w:rPr>
+        <w:t xml:space="preserve">Video 1 · Abundancia</w:t>
+      </w:r>
+      <w:r>
+        <w:t xml:space="preserve"> </w:t>
+      </w:r>
+      <w:r>
+        <w:t xml:space="preserve">¿Sientes que el dinero se te escapa antes de llegar? 🔓 Esto no es suerte: es un programa. Y un programa se hackea.</w:t>
+      </w:r>
+      <w:r>
+        <w:t xml:space="preserve"> </w:t>
+      </w:r>
+      <w:r>
+        <w:t xml:space="preserve">Pon tu mano en el pecho y repite conmigo con NAIA. Guárdalo y escúchalo antes de cobrar, pagar o vender. 💛</w:t>
+      </w:r>
+      <w:r>
+        <w:t xml:space="preserve"> </w:t>
+      </w:r>
+      <w:r>
+        <w:t xml:space="preserve">Lo que no se activa, no cambia y se transforma.</w:t>
+      </w:r>
+      <w:r>
+        <w:t xml:space="preserve"> </w:t>
+      </w:r>
+      <w:r>
+        <w:t xml:space="preserve">@mabradiante</w:t>
+      </w:r>
+      <w:r>
+        <w:t xml:space="preserve"> </w:t>
+      </w:r>
+      <w:r>
+        <w:t xml:space="preserve">#hackeatumente #abundancia #activacion #neurohacker #metodobnq</w:t>
+      </w:r>
+    </w:p>
+    <w:p>
+      <w:pPr>
+        <w:pStyle w:val="BodyText"/>
+      </w:pPr>
+      <w:r>
+        <w:rPr>
+          <w:bCs/>
+          <w:b/>
+        </w:rPr>
+        <w:t xml:space="preserve">Video 2 · Éxito</w:t>
+      </w:r>
+      <w:r>
+        <w:t xml:space="preserve"> </w:t>
+      </w:r>
+      <w:r>
+        <w:t xml:space="preserve">¿Y si no te da miedo fracasar… sino brillar? ✨ Hoy hackeamos el miedo al éxito.</w:t>
+      </w:r>
+      <w:r>
+        <w:t xml:space="preserve"> </w:t>
+      </w:r>
+      <w:r>
+        <w:t xml:space="preserve">Pon tu mano en el pecho y repite conmigo con NAIA. Guárdalo para cuando te quieras hacer pequeña. 💛</w:t>
+      </w:r>
+      <w:r>
+        <w:t xml:space="preserve"> </w:t>
+      </w:r>
+      <w:r>
+        <w:t xml:space="preserve">Lo que no se activa, no cambia y se transforma.</w:t>
+      </w:r>
+      <w:r>
+        <w:t xml:space="preserve"> </w:t>
+      </w:r>
+      <w:r>
+        <w:t xml:space="preserve">@mabradiante</w:t>
+      </w:r>
+      <w:r>
+        <w:t xml:space="preserve"> </w:t>
+      </w:r>
+      <w:r>
+        <w:t xml:space="preserve">#hackeatumente #exito #activacion #neurohacker #metodobnq</w:t>
+      </w:r>
+    </w:p>
+    <w:p>
+      <w:pPr>
+        <w:pStyle w:val="BodyText"/>
+      </w:pPr>
+      <w:r>
+        <w:rPr>
+          <w:bCs/>
+          <w:b/>
+        </w:rPr>
+        <w:t xml:space="preserve">Línea de venta opcional</w:t>
+      </w:r>
+      <w:r>
+        <w:t xml:space="preserve"> </w:t>
+      </w:r>
+      <w:r>
+        <w:t xml:space="preserve">(solo si ese día el calendario marca venta, nunca dos días seguidos):</w:t>
+      </w:r>
+      <w:r>
+        <w:t xml:space="preserve"> </w:t>
+      </w:r>
+      <w:r>
+        <w:t xml:space="preserve">“</w:t>
+      </w:r>
+      <w:r>
+        <w:t xml:space="preserve">¿Quieres los 10 audios de Activaciones Robóticas Millonarias? El link está en mi perfil.</w:t>
+      </w:r>
+      <w:r>
+        <w:t xml:space="preserve">”</w:t>
+      </w:r>
+    </w:p>
+    <w:bookmarkEnd w:id="29"/>
+    <w:bookmarkStart w:id="30" w:name="cómo-meterlo-en-el-calendario"/>
+    <w:p>
+      <w:pPr>
+        <w:pStyle w:val="Heading2"/>
+      </w:pPr>
+      <w:r>
+        <w:t xml:space="preserve">11. Cómo meterlo en el calendario</w:t>
+      </w:r>
+    </w:p>
+    <w:p>
+      <w:pPr>
+        <w:numPr>
+          <w:ilvl w:val="0"/>
+          <w:numId w:val="1007"/>
+        </w:numPr>
+        <w:pStyle w:val="Compact"/>
+      </w:pPr>
+      <w:r>
+        <w:t xml:space="preserve">Asignar 2 días por semana a</w:t>
+      </w:r>
+      <w:r>
+        <w:t xml:space="preserve"> </w:t>
+      </w:r>
+      <w:r>
+        <w:t xml:space="preserve">“</w:t>
+      </w:r>
+      <w:r>
+        <w:t xml:space="preserve">NAIA · Audio robótico</w:t>
+      </w:r>
+      <w:r>
+        <w:t xml:space="preserve">”</w:t>
+      </w:r>
+      <w:r>
+        <w:t xml:space="preserve"> </w:t>
+      </w:r>
+      <w:r>
+        <w:t xml:space="preserve">(recomendado: días SIN pieza de campaña del LIVE).</w:t>
+      </w:r>
+    </w:p>
+    <w:p>
+      <w:pPr>
+        <w:numPr>
+          <w:ilvl w:val="0"/>
+          <w:numId w:val="1007"/>
+        </w:numPr>
+        <w:pStyle w:val="Compact"/>
+      </w:pPr>
+      <w:r>
+        <w:t xml:space="preserve">Semana actual: Video 1 (Abundancia) y Video 2 (Éxito).</w:t>
+      </w:r>
+    </w:p>
+    <w:p>
+      <w:pPr>
+        <w:numPr>
+          <w:ilvl w:val="0"/>
+          <w:numId w:val="1007"/>
+        </w:numPr>
+        <w:pStyle w:val="Compact"/>
+      </w:pPr>
+      <w:r>
+        <w:t xml:space="preserve">Publicar en TikTok (prioridad), Reels, Shorts y estado/comunidad de WhatsApp el mismo día.</w:t>
+      </w:r>
+    </w:p>
+    <w:p>
+      <w:pPr>
+        <w:numPr>
+          <w:ilvl w:val="0"/>
+          <w:numId w:val="1007"/>
+        </w:numPr>
+        <w:pStyle w:val="Compact"/>
+      </w:pPr>
+      <w:r>
+        <w:t xml:space="preserve">Las demás piezas del día son de Mabel real (estrategia del mes + campaña del LIVE).</w:t>
+      </w:r>
+    </w:p>
+    <w:p>
+      <w:pPr>
+        <w:pStyle w:val="FirstParagraph"/>
+      </w:pPr>
+      <w:r>
         <w:rPr>
           <w:bCs/>
           <w:b/>
@@ -1139,8 +1529,8 @@
         <w:t xml:space="preserve">escribir 2 audios nuevos por semana, del tema que marque el objetivo de esa semana (hoy: dinero, para empujar el LIVE).</w:t>
       </w:r>
     </w:p>
-    <w:bookmarkEnd w:id="27"/>
-    <w:bookmarkEnd w:id="28"/>
+    <w:bookmarkEnd w:id="30"/>
+    <w:bookmarkEnd w:id="31"/>
     <w:sectPr/>
   </w:body>
 </w:document>
@@ -1455,6 +1845,36 @@
   </w:num>
   <w:num w:numId="1006">
     <w:abstractNumId w:val="991"/>
+  </w:num>
+  <w:num w:numId="1007">
+    <w:abstractNumId w:val="99411"/>
+    <w:lvlOverride w:ilvl="0">
+      <w:startOverride w:val="1"/>
+    </w:lvlOverride>
+    <w:lvlOverride w:ilvl="1">
+      <w:startOverride w:val="1"/>
+    </w:lvlOverride>
+    <w:lvlOverride w:ilvl="2">
+      <w:startOverride w:val="1"/>
+    </w:lvlOverride>
+    <w:lvlOverride w:ilvl="3">
+      <w:startOverride w:val="1"/>
+    </w:lvlOverride>
+    <w:lvlOverride w:ilvl="4">
+      <w:startOverride w:val="1"/>
+    </w:lvlOverride>
+    <w:lvlOverride w:ilvl="5">
+      <w:startOverride w:val="1"/>
+    </w:lvlOverride>
+    <w:lvlOverride w:ilvl="6">
+      <w:startOverride w:val="1"/>
+    </w:lvlOverride>
+    <w:lvlOverride w:ilvl="7">
+      <w:startOverride w:val="1"/>
+    </w:lvlOverride>
+    <w:lvlOverride w:ilvl="8">
+      <w:startOverride w:val="1"/>
+    </w:lvlOverride>
   </w:num>
 </w:numbering>
 </file>

</xml_diff>

<commit_message>
NAIA: videos aprobados, lip-sync pendiente de prueba, días y temas los define el chat de estrategia
Co-Authored-By: Claude Opus 5.5 <noreply@anthropic.com>
Claude-Session: https://claude.ai/code/session_01575tSk5hf54pmGQ4qcNCo5
</commit_message>
<xml_diff>
--- a/nica-apify/naia/LINEAMIENTOS_NAIA_para_calendario.docx
+++ b/nica-apify/naia/LINEAMIENTOS_NAIA_para_calendario.docx
@@ -2,7 +2,7 @@
 <file path=word/document.xml><?xml version="1.0" encoding="utf-8"?>
 <w:document xmlns:w="http://schemas.openxmlformats.org/wordprocessingml/2006/main" xmlns:m="http://schemas.openxmlformats.org/officeDocument/2006/math" xmlns:r="http://schemas.openxmlformats.org/officeDocument/2006/relationships" xmlns:o="urn:schemas-microsoft-com:office:office" xmlns:v="urn:schemas-microsoft-com:vml" xmlns:w10="urn:schemas-microsoft-com:office:word" xmlns:a="http://schemas.openxmlformats.org/drawingml/2006/main" xmlns:pic="http://schemas.openxmlformats.org/drawingml/2006/picture" xmlns:wp="http://schemas.openxmlformats.org/drawingml/2006/wordprocessingDrawing">
   <w:body>
-    <w:bookmarkStart w:id="31" w:name="X0c2a59dc7dc337ab663efd10c0cae180e4ad560"/>
+    <w:bookmarkStart w:id="32" w:name="X0c2a59dc7dc337ab663efd10c0cae180e4ad560"/>
     <w:p>
       <w:pPr>
         <w:pStyle w:val="Heading1"/>
@@ -1530,7 +1530,122 @@
       </w:r>
     </w:p>
     <w:bookmarkEnd w:id="30"/>
+    <w:bookmarkStart w:id="31" w:name="decisiones-de-mabel-30-oct-2026"/>
+    <w:p>
+      <w:pPr>
+        <w:pStyle w:val="Heading2"/>
+      </w:pPr>
+      <w:r>
+        <w:t xml:space="preserve">Decisiones de Mabel (30-oct-2026)</w:t>
+      </w:r>
+    </w:p>
+    <w:p>
+      <w:pPr>
+        <w:numPr>
+          <w:ilvl w:val="0"/>
+          <w:numId w:val="1008"/>
+        </w:numPr>
+        <w:pStyle w:val="Compact"/>
+      </w:pPr>
+      <w:r>
+        <w:t xml:space="preserve">Videos de Abundancia y Éxito:</w:t>
+      </w:r>
+      <w:r>
+        <w:t xml:space="preserve"> </w:t>
+      </w:r>
+      <w:r>
+        <w:rPr>
+          <w:bCs/>
+          <w:b/>
+        </w:rPr>
+        <w:t xml:space="preserve">aprobados</w:t>
+      </w:r>
+      <w:r>
+        <w:t xml:space="preserve">.</w:t>
+      </w:r>
+    </w:p>
+    <w:p>
+      <w:pPr>
+        <w:numPr>
+          <w:ilvl w:val="0"/>
+          <w:numId w:val="1008"/>
+        </w:numPr>
+        <w:pStyle w:val="Compact"/>
+      </w:pPr>
+      <w:r>
+        <w:rPr>
+          <w:bCs/>
+          <w:b/>
+        </w:rPr>
+        <w:t xml:space="preserve">Mabel quiere que NAIA MUEVA LA BOCA al hablar</w:t>
+      </w:r>
+      <w:r>
+        <w:t xml:space="preserve"> </w:t>
+      </w:r>
+      <w:r>
+        <w:t xml:space="preserve">(lip-sync). Se hace aparte, sobre el video ya armado,</w:t>
+      </w:r>
+      <w:r>
+        <w:t xml:space="preserve"> </w:t>
+      </w:r>
+      <w:r>
+        <w:t xml:space="preserve">con la misma voz A. Opción recomendada: ElevenLabs</w:t>
+      </w:r>
+      <w:r>
+        <w:t xml:space="preserve"> </w:t>
+      </w:r>
+      <w:r>
+        <w:t xml:space="preserve">“</w:t>
+      </w:r>
+      <w:r>
+        <w:t xml:space="preserve">Sync LipSync 3</w:t>
+      </w:r>
+      <w:r>
+        <w:t xml:space="preserve">”</w:t>
+      </w:r>
+      <w:r>
+        <w:t xml:space="preserve"> </w:t>
+      </w:r>
+      <w:r>
+        <w:t xml:space="preserve">(gasta créditos: primero una</w:t>
+      </w:r>
+      <w:r>
+        <w:t xml:space="preserve"> </w:t>
+      </w:r>
+      <w:r>
+        <w:t xml:space="preserve">prueba corta con OK de Mabel). Hasta aprobar la prueba, se usan los videos sin boca.</w:t>
+      </w:r>
+    </w:p>
+    <w:p>
+      <w:pPr>
+        <w:numPr>
+          <w:ilvl w:val="0"/>
+          <w:numId w:val="1008"/>
+        </w:numPr>
+        <w:pStyle w:val="Compact"/>
+      </w:pPr>
+      <w:r>
+        <w:rPr>
+          <w:bCs/>
+          <w:b/>
+        </w:rPr>
+        <w:t xml:space="preserve">Días de NAIA (2 por semana) y temas de sus audios:</w:t>
+      </w:r>
+      <w:r>
+        <w:t xml:space="preserve"> </w:t>
+      </w:r>
+      <w:r>
+        <w:t xml:space="preserve">los define el chat de ESTRATEGIA / calendario</w:t>
+      </w:r>
+      <w:r>
+        <w:t xml:space="preserve"> </w:t>
+      </w:r>
+      <w:r>
+        <w:t xml:space="preserve">de Mabel. Aquí no se inventan.</w:t>
+      </w:r>
+    </w:p>
     <w:bookmarkEnd w:id="31"/>
+    <w:bookmarkEnd w:id="32"/>
     <w:sectPr/>
   </w:body>
 </w:document>
@@ -1875,6 +1990,9 @@
     <w:lvlOverride w:ilvl="8">
       <w:startOverride w:val="1"/>
     </w:lvlOverride>
+  </w:num>
+  <w:num w:numId="1008">
+    <w:abstractNumId w:val="991"/>
   </w:num>
 </w:numbering>
 </file>

</xml_diff>

<commit_message>
NAIA: sin lip-sync, se queda el formato aprobado
Co-Authored-By: Claude Opus 5.5 <noreply@anthropic.com>
Claude-Session: https://claude.ai/code/session_01575tSk5hf54pmGQ4qcNCo5
</commit_message>
<xml_diff>
--- a/nica-apify/naia/LINEAMIENTOS_NAIA_para_calendario.docx
+++ b/nica-apify/naia/LINEAMIENTOS_NAIA_para_calendario.docx
@@ -1642,6 +1642,50 @@
       </w:r>
       <w:r>
         <w:t xml:space="preserve">de Mabel. Aquí no se inventan.</w:t>
+      </w:r>
+    </w:p>
+    <w:p>
+      <w:pPr>
+        <w:numPr>
+          <w:ilvl w:val="0"/>
+          <w:numId w:val="1008"/>
+        </w:numPr>
+        <w:pStyle w:val="Compact"/>
+      </w:pPr>
+      <w:r>
+        <w:rPr>
+          <w:bCs/>
+          <w:b/>
+        </w:rPr>
+        <w:t xml:space="preserve">ACTUALIZACIÓN 30-oct:</w:t>
+      </w:r>
+      <w:r>
+        <w:t xml:space="preserve"> </w:t>
+      </w:r>
+      <w:r>
+        <w:t xml:space="preserve">Mabel decidió</w:t>
+      </w:r>
+      <w:r>
+        <w:t xml:space="preserve"> </w:t>
+      </w:r>
+      <w:r>
+        <w:rPr>
+          <w:bCs/>
+          <w:b/>
+        </w:rPr>
+        <w:t xml:space="preserve">SIN mover la boca</w:t>
+      </w:r>
+      <w:r>
+        <w:t xml:space="preserve"> </w:t>
+      </w:r>
+      <w:r>
+        <w:t xml:space="preserve">(sin lip-sync, sin gasto). Se queda el formato</w:t>
+      </w:r>
+      <w:r>
+        <w:t xml:space="preserve"> </w:t>
+      </w:r>
+      <w:r>
+        <w:t xml:space="preserve">de los 2 videos aprobados: viento, rueda dorada, voz A y subtítulos.</w:t>
       </w:r>
     </w:p>
     <w:bookmarkEnd w:id="31"/>

</xml_diff>

<commit_message>
NAIA: flujo semanal (estrategia define temas y guiones; NICA produce voz y videos)
Co-Authored-By: Claude Opus 5.5 <noreply@anthropic.com>
Claude-Session: https://claude.ai/code/session_01575tSk5hf54pmGQ4qcNCo5
</commit_message>
<xml_diff>
--- a/nica-apify/naia/LINEAMIENTOS_NAIA_para_calendario.docx
+++ b/nica-apify/naia/LINEAMIENTOS_NAIA_para_calendario.docx
@@ -2,7 +2,7 @@
 <file path=word/document.xml><?xml version="1.0" encoding="utf-8"?>
 <w:document xmlns:w="http://schemas.openxmlformats.org/wordprocessingml/2006/main" xmlns:m="http://schemas.openxmlformats.org/officeDocument/2006/math" xmlns:r="http://schemas.openxmlformats.org/officeDocument/2006/relationships" xmlns:o="urn:schemas-microsoft-com:office:office" xmlns:v="urn:schemas-microsoft-com:vml" xmlns:w10="urn:schemas-microsoft-com:office:word" xmlns:a="http://schemas.openxmlformats.org/drawingml/2006/main" xmlns:pic="http://schemas.openxmlformats.org/drawingml/2006/picture" xmlns:wp="http://schemas.openxmlformats.org/drawingml/2006/wordprocessingDrawing">
   <w:body>
-    <w:bookmarkStart w:id="32" w:name="X0c2a59dc7dc337ab663efd10c0cae180e4ad560"/>
+    <w:bookmarkStart w:id="33" w:name="X0c2a59dc7dc337ab663efd10c0cae180e4ad560"/>
     <w:p>
       <w:pPr>
         <w:pStyle w:val="Heading1"/>
@@ -1689,7 +1689,188 @@
       </w:r>
     </w:p>
     <w:bookmarkEnd w:id="31"/>
+    <w:bookmarkStart w:id="32" w:name="X8bf409cb5538969fb61e1f7ed0fefda7161316f"/>
+    <w:p>
+      <w:pPr>
+        <w:pStyle w:val="Heading2"/>
+      </w:pPr>
+      <w:r>
+        <w:t xml:space="preserve">12. FLUJO SEMANAL DE NAIA (cada semana, sin excepción)</w:t>
+      </w:r>
+    </w:p>
+    <w:p>
+      <w:pPr>
+        <w:numPr>
+          <w:ilvl w:val="0"/>
+          <w:numId w:val="1009"/>
+        </w:numPr>
+        <w:pStyle w:val="Compact"/>
+      </w:pPr>
+      <w:r>
+        <w:rPr>
+          <w:bCs/>
+          <w:b/>
+        </w:rPr>
+        <w:t xml:space="preserve">Este chat (estrategia / calendario)</w:t>
+      </w:r>
+      <w:r>
+        <w:t xml:space="preserve"> </w:t>
+      </w:r>
+      <w:r>
+        <w:t xml:space="preserve">define cada semana: los</w:t>
+      </w:r>
+      <w:r>
+        <w:t xml:space="preserve"> </w:t>
+      </w:r>
+      <w:r>
+        <w:rPr>
+          <w:bCs/>
+          <w:b/>
+        </w:rPr>
+        <w:t xml:space="preserve">2 días</w:t>
+      </w:r>
+      <w:r>
+        <w:t xml:space="preserve"> </w:t>
+      </w:r>
+      <w:r>
+        <w:t xml:space="preserve">de NAIA, los</w:t>
+      </w:r>
+      <w:r>
+        <w:t xml:space="preserve"> </w:t>
+      </w:r>
+      <w:r>
+        <w:rPr>
+          <w:bCs/>
+          <w:b/>
+        </w:rPr>
+        <w:t xml:space="preserve">2 temas</w:t>
+      </w:r>
+      <w:r>
+        <w:t xml:space="preserve"> </w:t>
+      </w:r>
+      <w:r>
+        <w:t xml:space="preserve">y los</w:t>
+      </w:r>
+      <w:r>
+        <w:t xml:space="preserve"> </w:t>
+      </w:r>
+      <w:r>
+        <w:rPr>
+          <w:bCs/>
+          <w:b/>
+        </w:rPr>
+        <w:t xml:space="preserve">2 guiones</w:t>
+      </w:r>
+      <w:r>
+        <w:t xml:space="preserve"> </w:t>
+      </w:r>
+      <w:r>
+        <w:t xml:space="preserve">(con la estructura del punto 4) + sus 2 captions.</w:t>
+      </w:r>
+    </w:p>
+    <w:p>
+      <w:pPr>
+        <w:numPr>
+          <w:ilvl w:val="0"/>
+          <w:numId w:val="1009"/>
+        </w:numPr>
+        <w:pStyle w:val="Compact"/>
+      </w:pPr>
+      <w:r>
+        <w:t xml:space="preserve">Al terminar, entrega a Mabel un bloque listo para copiar llamado</w:t>
+      </w:r>
+      <w:r>
+        <w:t xml:space="preserve"> </w:t>
+      </w:r>
+      <w:r>
+        <w:rPr>
+          <w:bCs/>
+          <w:b/>
+        </w:rPr>
+        <w:t xml:space="preserve">“</w:t>
+      </w:r>
+      <w:r>
+        <w:rPr>
+          <w:bCs/>
+          <w:b/>
+        </w:rPr>
+        <w:t xml:space="preserve">PARA NICA · NAIA semana [fecha]</w:t>
+      </w:r>
+      <w:r>
+        <w:rPr>
+          <w:bCs/>
+          <w:b/>
+        </w:rPr>
+        <w:t xml:space="preserve">”</w:t>
+      </w:r>
+      <w:r>
+        <w:t xml:space="preserve"> </w:t>
+      </w:r>
+      <w:r>
+        <w:t xml:space="preserve">con: día, tema, guion completo (una frase por línea) y caption de cada uno.</w:t>
+      </w:r>
+    </w:p>
+    <w:p>
+      <w:pPr>
+        <w:numPr>
+          <w:ilvl w:val="0"/>
+          <w:numId w:val="1009"/>
+        </w:numPr>
+        <w:pStyle w:val="Compact"/>
+      </w:pPr>
+      <w:r>
+        <w:rPr>
+          <w:bCs/>
+          <w:b/>
+        </w:rPr>
+        <w:t xml:space="preserve">Mabel lleva ese bloque al chat de NICA (producción de NAIA)</w:t>
+      </w:r>
+      <w:r>
+        <w:t xml:space="preserve">. Ahí se generan la voz de NAIA y los 2 videos verticales (mismo clip, sin mover la boca, subtítulos). Gasto: $0.</w:t>
+      </w:r>
+    </w:p>
+    <w:p>
+      <w:pPr>
+        <w:numPr>
+          <w:ilvl w:val="0"/>
+          <w:numId w:val="1009"/>
+        </w:numPr>
+        <w:pStyle w:val="Compact"/>
+      </w:pPr>
+      <w:r>
+        <w:t xml:space="preserve">Mabel publica los videos los días marcados en el calendario.</w:t>
+      </w:r>
+    </w:p>
+    <w:p>
+      <w:pPr>
+        <w:numPr>
+          <w:ilvl w:val="0"/>
+          <w:numId w:val="1010"/>
+        </w:numPr>
+        <w:pStyle w:val="Compact"/>
+      </w:pPr>
+      <w:r>
+        <w:t xml:space="preserve">Este chat</w:t>
+      </w:r>
+      <w:r>
+        <w:t xml:space="preserve"> </w:t>
+      </w:r>
+      <w:r>
+        <w:rPr>
+          <w:bCs/>
+          <w:b/>
+        </w:rPr>
+        <w:t xml:space="preserve">NO</w:t>
+      </w:r>
+      <w:r>
+        <w:t xml:space="preserve"> </w:t>
+      </w:r>
+      <w:r>
+        <w:t xml:space="preserve">genera audios ni videos de NAIA: solo define días, temas, guiones y captions.</w:t>
+      </w:r>
+    </w:p>
     <w:bookmarkEnd w:id="32"/>
+    <w:bookmarkEnd w:id="33"/>
     <w:sectPr/>
   </w:body>
 </w:document>
@@ -2036,6 +2217,39 @@
     </w:lvlOverride>
   </w:num>
   <w:num w:numId="1008">
+    <w:abstractNumId w:val="991"/>
+  </w:num>
+  <w:num w:numId="1009">
+    <w:abstractNumId w:val="99411"/>
+    <w:lvlOverride w:ilvl="0">
+      <w:startOverride w:val="1"/>
+    </w:lvlOverride>
+    <w:lvlOverride w:ilvl="1">
+      <w:startOverride w:val="1"/>
+    </w:lvlOverride>
+    <w:lvlOverride w:ilvl="2">
+      <w:startOverride w:val="1"/>
+    </w:lvlOverride>
+    <w:lvlOverride w:ilvl="3">
+      <w:startOverride w:val="1"/>
+    </w:lvlOverride>
+    <w:lvlOverride w:ilvl="4">
+      <w:startOverride w:val="1"/>
+    </w:lvlOverride>
+    <w:lvlOverride w:ilvl="5">
+      <w:startOverride w:val="1"/>
+    </w:lvlOverride>
+    <w:lvlOverride w:ilvl="6">
+      <w:startOverride w:val="1"/>
+    </w:lvlOverride>
+    <w:lvlOverride w:ilvl="7">
+      <w:startOverride w:val="1"/>
+    </w:lvlOverride>
+    <w:lvlOverride w:ilvl="8">
+      <w:startOverride w:val="1"/>
+    </w:lvlOverride>
+  </w:num>
+  <w:num w:numId="1010">
     <w:abstractNumId w:val="991"/>
   </w:num>
 </w:numbering>

</xml_diff>

<commit_message>
Regla: todo video lleva su copy con CTA al link del perfil
Co-Authored-By: Claude Opus 5.5 <noreply@anthropic.com>
Claude-Session: https://claude.ai/code/session_01575tSk5hf54pmGQ4qcNCo5
</commit_message>
<xml_diff>
--- a/nica-apify/naia/LINEAMIENTOS_NAIA_para_calendario.docx
+++ b/nica-apify/naia/LINEAMIENTOS_NAIA_para_calendario.docx
@@ -2,7 +2,7 @@
 <file path=word/document.xml><?xml version="1.0" encoding="utf-8"?>
 <w:document xmlns:w="http://schemas.openxmlformats.org/wordprocessingml/2006/main" xmlns:m="http://schemas.openxmlformats.org/officeDocument/2006/math" xmlns:r="http://schemas.openxmlformats.org/officeDocument/2006/relationships" xmlns:o="urn:schemas-microsoft-com:office:office" xmlns:v="urn:schemas-microsoft-com:vml" xmlns:w10="urn:schemas-microsoft-com:office:word" xmlns:a="http://schemas.openxmlformats.org/drawingml/2006/main" xmlns:pic="http://schemas.openxmlformats.org/drawingml/2006/picture" xmlns:wp="http://schemas.openxmlformats.org/drawingml/2006/wordprocessingDrawing">
   <w:body>
-    <w:bookmarkStart w:id="33" w:name="X0c2a59dc7dc337ab663efd10c0cae180e4ad560"/>
+    <w:bookmarkStart w:id="34" w:name="X0c2a59dc7dc337ab663efd10c0cae180e4ad560"/>
     <w:p>
       <w:pPr>
         <w:pStyle w:val="Heading1"/>
@@ -1354,6 +1354,12 @@
         <w:t xml:space="preserve"> </w:t>
       </w:r>
       <w:r>
+        <w:t xml:space="preserve">👉 Todo para seguir hackeando tu dinero está en el link de mi perfil.</w:t>
+      </w:r>
+      <w:r>
+        <w:t xml:space="preserve"> </w:t>
+      </w:r>
+      <w:r>
         <w:t xml:space="preserve">@mabradiante</w:t>
       </w:r>
       <w:r>
@@ -1391,6 +1397,12 @@
       </w:r>
       <w:r>
         <w:t xml:space="preserve">Lo que no se activa, no cambia y se transforma.</w:t>
+      </w:r>
+      <w:r>
+        <w:t xml:space="preserve"> </w:t>
+      </w:r>
+      <w:r>
+        <w:t xml:space="preserve">👉 Todo para seguir hackeando tu mente está en el link de mi perfil.</w:t>
       </w:r>
       <w:r>
         <w:t xml:space="preserve"> </w:t>
@@ -1870,7 +1882,90 @@
       </w:r>
     </w:p>
     <w:bookmarkEnd w:id="32"/>
+    <w:bookmarkStart w:id="33" w:name="X7296f78c7184d5257924f3627e1a37fb6a2bfe2"/>
+    <w:p>
+      <w:pPr>
+        <w:pStyle w:val="Heading2"/>
+      </w:pPr>
+      <w:r>
+        <w:t xml:space="preserve">✅ REGLA FIJA DE MABEL (30-oct-2026): TODO VIDEO LLEVA SU COPY CON CTA AL LINK DEL PERFIL</w:t>
+      </w:r>
+    </w:p>
+    <w:p>
+      <w:pPr>
+        <w:pStyle w:val="FirstParagraph"/>
+      </w:pPr>
+      <w:r>
+        <w:t xml:space="preserve">Cada video que se entregue (de NAIA o de Mabel) va</w:t>
+      </w:r>
+      <w:r>
+        <w:t xml:space="preserve"> </w:t>
+      </w:r>
+      <w:r>
+        <w:rPr>
+          <w:bCs/>
+          <w:b/>
+        </w:rPr>
+        <w:t xml:space="preserve">siempre</w:t>
+      </w:r>
+      <w:r>
+        <w:t xml:space="preserve"> </w:t>
+      </w:r>
+      <w:r>
+        <w:t xml:space="preserve">acompañado de su copy listo</w:t>
+      </w:r>
+      <w:r>
+        <w:t xml:space="preserve"> </w:t>
+      </w:r>
+      <w:r>
+        <w:t xml:space="preserve">para pegar, y el copy</w:t>
+      </w:r>
+      <w:r>
+        <w:t xml:space="preserve"> </w:t>
+      </w:r>
+      <w:r>
+        <w:rPr>
+          <w:bCs/>
+          <w:b/>
+        </w:rPr>
+        <w:t xml:space="preserve">siempre cierra con CTA al link del perfil</w:t>
+      </w:r>
+      <w:r>
+        <w:t xml:space="preserve">, porque ahí están todos los</w:t>
+      </w:r>
+      <w:r>
+        <w:t xml:space="preserve"> </w:t>
+      </w:r>
+      <w:r>
+        <w:t xml:space="preserve">links de productos, fórmulas, etc. Ej.:</w:t>
+      </w:r>
+      <w:r>
+        <w:t xml:space="preserve"> </w:t>
+      </w:r>
+      <w:r>
+        <w:t xml:space="preserve">“</w:t>
+      </w:r>
+      <w:r>
+        <w:t xml:space="preserve">👉 Todo para seguir hackeando tu mente está en el link</w:t>
+      </w:r>
+      <w:r>
+        <w:t xml:space="preserve"> </w:t>
+      </w:r>
+      <w:r>
+        <w:t xml:space="preserve">de mi perfil.</w:t>
+      </w:r>
+      <w:r>
+        <w:t xml:space="preserve">”</w:t>
+      </w:r>
+      <w:r>
+        <w:t xml:space="preserve"> </w:t>
+      </w:r>
+      <w:r>
+        <w:t xml:space="preserve">Sin presión, una sola acción.</w:t>
+      </w:r>
+    </w:p>
     <w:bookmarkEnd w:id="33"/>
+    <w:bookmarkEnd w:id="34"/>
     <w:sectPr/>
   </w:body>
 </w:document>

</xml_diff>